<commit_message>
Working on Figma file and add hours in timesheet
</commit_message>
<xml_diff>
--- a/Week_2/Figma/Links for images.docx
+++ b/Week_2/Figma/Links for images.docx
@@ -14,15 +14,65 @@
         </w:rPr>
         <w:t xml:space="preserve">Logo Reference: </w:t>
       </w:r>
-    </w:p>
-    <w:p>
-      <w:r>
-        <w:t>https://www.freepik.com/premium-vector/health-logo-design_38276652.htm#fromView=search&amp;page=1&amp;position=14&amp;uuid=d797f62c-dfc4-4e0f-86ff-88f0b80cae84&amp;query=Heal</w:t>
+      <w:r>
+        <w:rPr>
+          <w:sz w:val="28"/>
+        </w:rPr>
+        <w:br/>
+      </w:r>
+      <w:r>
+        <w:rPr>
+          <w:sz w:val="28"/>
+        </w:rPr>
+        <w:br/>
+      </w:r>
+      <w:r>
+        <w:rPr>
+          <w:sz w:val="28"/>
+        </w:rPr>
+        <w:br/>
+      </w:r>
+      <w:r>
+        <w:rPr>
+          <w:sz w:val="28"/>
+        </w:rPr>
+        <w:t xml:space="preserve">Banner background Image: </w:t>
+      </w:r>
+      <w:hyperlink r:id="rId4" w:history="1">
+        <w:r>
+          <w:rPr>
+            <w:rStyle w:val="Hyperlink"/>
+            <w:sz w:val="28"/>
+          </w:rPr>
+          <w:t>https://www.freepik.com/free-vector/blue-medical-healthcare-background-with-cardiograph_2870381.htm#fromView=search&amp;page=2&amp;position=2&amp;uuid=313fdee4-740a-4836-b266-da390f693292&amp;query=blue+background+hospital</w:t>
+        </w:r>
+      </w:hyperlink>
+      <w:r>
+        <w:rPr>
+          <w:sz w:val="28"/>
+        </w:rPr>
+        <w:br/>
+      </w:r>
+      <w:r>
+        <w:rPr>
+          <w:sz w:val="28"/>
+        </w:rPr>
+        <w:br/>
       </w:r>
       <w:bookmarkStart w:id="0" w:name="_GoBack"/>
       <w:bookmarkEnd w:id="0"/>
       <w:r>
-        <w:t>thcare+logo+blue</w:t>
+        <w:rPr>
+          <w:sz w:val="28"/>
+        </w:rPr>
+        <w:br/>
+        <w:t xml:space="preserve">Banner doctor Image: </w:t>
+      </w:r>
+      <w:r>
+        <w:rPr>
+          <w:sz w:val="28"/>
+        </w:rPr>
+        <w:t>https://www.freepik.com/free-psd/doctor-preparing-routine-medical-check_44989994.htm#fromView=search&amp;page=1&amp;position=28&amp;uuid=7251352e-c326-41c7-9a6e-7cb1d6da50a2&amp;query=doctor+image</w:t>
       </w:r>
     </w:p>
     <w:sectPr>
@@ -456,6 +506,17 @@
     <w:semiHidden/>
     <w:unhideWhenUsed/>
   </w:style>
+  <w:style w:type="character" w:styleId="Hyperlink">
+    <w:name w:val="Hyperlink"/>
+    <w:basedOn w:val="DefaultParagraphFont"/>
+    <w:uiPriority w:val="99"/>
+    <w:unhideWhenUsed/>
+    <w:rsid w:val="002B5AA8"/>
+    <w:rPr>
+      <w:color w:val="0563C1" w:themeColor="hyperlink"/>
+      <w:u w:val="single"/>
+    </w:rPr>
+  </w:style>
 </w:styles>
 </file>
 

</xml_diff>